<commit_message>
Lesson 3: resin questions moved onto the student sheet, answers teacher-only
Co-authored-by: Cursor <cursoragent@cursor.com>
</commit_message>
<xml_diff>
--- a/lessons/03-get-it-back/resources/l3-student-sheets-EDITABLE.docx
+++ b/lessons/03-get-it-back/resources/l3-student-sheets-EDITABLE.docx
@@ -3583,6 +3583,547 @@
         </w:rPr>
         <w:t xml:space="preserve">Work out both methods' recovery as a percentage of 8 g. How big is the gap between them? Is that gap bigger than the difference between two groups using the SAME method — and what would that tell you?</w:t>
       </w:r>
+    </w:p>
+    <w:p>
+      <w:pPr>
+        <w:spacing w:after="30" w:before="40" w:line="260"/>
+      </w:pPr>
+      <w:r>
+        <w:rPr>
+          <w:rFonts w:ascii="Calibri" w:cs="Calibri" w:eastAsia="Calibri" w:hAnsi="Calibri"/>
+          <w:b/>
+          <w:bCs/>
+          <w:color w:val="E8930C"/>
+          <w:sz w:val="17"/>
+          <w:szCs w:val="17"/>
+        </w:rPr>
+        <w:t xml:space="preserve">YEAR 6 SCIENCE · LESSON 3</w:t>
+      </w:r>
+    </w:p>
+    <w:p>
+      <w:pPr>
+        <w:pBdr>
+          <w:bottom w:val="single" w:color="E8930C" w:sz="12" w:space="5"/>
+        </w:pBdr>
+        <w:spacing w:after="100" w:before="0"/>
+      </w:pPr>
+      <w:r>
+        <w:rPr>
+          <w:rFonts w:ascii="Calibri" w:cs="Calibri" w:eastAsia="Calibri" w:hAnsi="Calibri"/>
+          <w:b/>
+          <w:bCs/>
+          <w:color w:val="1B2A4A"/>
+          <w:sz w:val="30"/>
+          <w:szCs w:val="30"/>
+        </w:rPr>
+        <w:t xml:space="preserve">7 · Plant resin — the part that matters</w:t>
+      </w:r>
+    </w:p>
+    <w:p>
+      <w:pPr>
+        <w:spacing w:after="70" w:before="40" w:line="260"/>
+      </w:pPr>
+      <w:r>
+        <w:rPr>
+          <w:rFonts w:ascii="Calibri" w:cs="Calibri" w:eastAsia="Calibri" w:hAnsi="Calibri"/>
+          <w:color w:val="222222"/>
+          <w:sz w:val="19"/>
+          <w:szCs w:val="19"/>
+        </w:rPr>
+        <w:t xml:space="preserve">Across Australia, First Nations peoples made adhesives from plant resin, including resin from spinifex and from grass trees. Warm it and it softens. Let it cool and it sets hard. It holds a stone point onto a spear shaft, a blade into a handle, a barb onto a hook.</w:t>
+      </w:r>
+    </w:p>
+    <w:p>
+      <w:pPr>
+        <w:spacing w:after="70" w:before="70" w:line="260"/>
+      </w:pPr>
+      <w:r>
+        <w:rPr>
+          <w:rFonts w:ascii="Calibri" w:cs="Calibri" w:eastAsia="Calibri" w:hAnsi="Calibri"/>
+          <w:color w:val="222222"/>
+          <w:sz w:val="19"/>
+          <w:szCs w:val="19"/>
+        </w:rPr>
+        <w:t xml:space="preserve">Years later, out on Country, a long way from anywhere, the tool breaks. You do not need a new one. You warm the resin again, it softens again, you reset the point, and it hardens again — the same material, as many times as you need.</w:t>
+      </w:r>
+    </w:p>
+    <w:p>
+      <w:pPr>
+        <w:spacing w:after="30" w:before="100" w:line="260"/>
+      </w:pPr>
+      <w:r>
+        <w:rPr>
+          <w:rFonts w:ascii="Calibri" w:cs="Calibri" w:eastAsia="Calibri" w:hAnsi="Calibri"/>
+          <w:b/>
+          <w:bCs/>
+          <w:color w:val="222222"/>
+          <w:sz w:val="19"/>
+          <w:szCs w:val="19"/>
+        </w:rPr>
+        <w:t xml:space="preserve">1 · Is softening and resetting resin a reversible or an irreversible change? How do you know?</w:t>
+      </w:r>
+    </w:p>
+    <w:tbl>
+      <w:tblPr>
+        <w:tblW w:type="dxa" w:w="9600"/>
+        <w:tblBorders>
+          <w:top w:val="none" w:color="FFFFFF" w:sz="0"/>
+          <w:left w:val="none" w:color="FFFFFF" w:sz="0"/>
+          <w:bottom w:val="none" w:color="FFFFFF" w:sz="0"/>
+          <w:right w:val="none" w:color="FFFFFF" w:sz="0"/>
+          <w:insideH w:val="single" w:color="AEB4C2" w:sz="4"/>
+          <w:insideV w:val="none" w:color="FFFFFF" w:sz="0"/>
+        </w:tblBorders>
+      </w:tblPr>
+      <w:tblGrid>
+        <w:gridCol w:w="9600"/>
+      </w:tblGrid>
+      <w:tr>
+        <w:tc>
+          <w:tcPr>
+            <w:tcW w:type="dxa" w:w="9600"/>
+            <w:tcBorders>
+              <w:top w:val="none" w:color="FFFFFF" w:sz="0"/>
+              <w:left w:val="none" w:color="FFFFFF" w:sz="0"/>
+              <w:bottom w:val="single" w:color="AEB4C2" w:sz="4"/>
+              <w:right w:val="none" w:color="FFFFFF" w:sz="0"/>
+            </w:tcBorders>
+            <w:tcMar>
+              <w:top w:type="dxa" w:w="0"/>
+              <w:left w:type="dxa" w:w="0"/>
+              <w:bottom w:type="dxa" w:w="0"/>
+              <w:right w:type="dxa" w:w="0"/>
+            </w:tcMar>
+          </w:tcPr>
+          <w:p>
+            <w:pPr>
+              <w:spacing w:after="85" w:before="85"/>
+            </w:pPr>
+            <w:r>
+              <w:rPr>
+                <w:rFonts w:ascii="Calibri" w:cs="Calibri" w:eastAsia="Calibri" w:hAnsi="Calibri"/>
+                <w:color w:val="222222"/>
+                <w:sz w:val="20"/>
+                <w:szCs w:val="20"/>
+              </w:rPr>
+              <w:t xml:space="preserve"> </w:t>
+            </w:r>
+          </w:p>
+        </w:tc>
+      </w:tr>
+      <w:tr>
+        <w:tc>
+          <w:tcPr>
+            <w:tcW w:type="dxa" w:w="9600"/>
+            <w:tcBorders>
+              <w:top w:val="none" w:color="FFFFFF" w:sz="0"/>
+              <w:left w:val="none" w:color="FFFFFF" w:sz="0"/>
+              <w:bottom w:val="single" w:color="AEB4C2" w:sz="4"/>
+              <w:right w:val="none" w:color="FFFFFF" w:sz="0"/>
+            </w:tcBorders>
+            <w:tcMar>
+              <w:top w:type="dxa" w:w="0"/>
+              <w:left w:type="dxa" w:w="0"/>
+              <w:bottom w:type="dxa" w:w="0"/>
+              <w:right w:type="dxa" w:w="0"/>
+            </w:tcMar>
+          </w:tcPr>
+          <w:p>
+            <w:pPr>
+              <w:spacing w:after="85" w:before="85"/>
+            </w:pPr>
+            <w:r>
+              <w:rPr>
+                <w:rFonts w:ascii="Calibri" w:cs="Calibri" w:eastAsia="Calibri" w:hAnsi="Calibri"/>
+                <w:color w:val="222222"/>
+                <w:sz w:val="20"/>
+                <w:szCs w:val="20"/>
+              </w:rPr>
+              <w:t xml:space="preserve"> </w:t>
+            </w:r>
+          </w:p>
+        </w:tc>
+      </w:tr>
+    </w:tbl>
+    <w:p>
+      <w:pPr>
+        <w:spacing w:after="120"/>
+      </w:pPr>
+    </w:p>
+    <w:p>
+      <w:pPr>
+        <w:spacing w:after="30" w:before="100" w:line="260"/>
+      </w:pPr>
+      <w:r>
+        <w:rPr>
+          <w:rFonts w:ascii="Calibri" w:cs="Calibri" w:eastAsia="Calibri" w:hAnsi="Calibri"/>
+          <w:b/>
+          <w:bCs/>
+          <w:color w:val="222222"/>
+          <w:sz w:val="19"/>
+          <w:szCs w:val="19"/>
+        </w:rPr>
+        <w:t xml:space="preserve">2 · Which change we have studied is it most like — melting chocolate, or toasting bread? Say why.</w:t>
+      </w:r>
+    </w:p>
+    <w:tbl>
+      <w:tblPr>
+        <w:tblW w:type="dxa" w:w="9600"/>
+        <w:tblBorders>
+          <w:top w:val="none" w:color="FFFFFF" w:sz="0"/>
+          <w:left w:val="none" w:color="FFFFFF" w:sz="0"/>
+          <w:bottom w:val="none" w:color="FFFFFF" w:sz="0"/>
+          <w:right w:val="none" w:color="FFFFFF" w:sz="0"/>
+          <w:insideH w:val="single" w:color="AEB4C2" w:sz="4"/>
+          <w:insideV w:val="none" w:color="FFFFFF" w:sz="0"/>
+        </w:tblBorders>
+      </w:tblPr>
+      <w:tblGrid>
+        <w:gridCol w:w="9600"/>
+      </w:tblGrid>
+      <w:tr>
+        <w:tc>
+          <w:tcPr>
+            <w:tcW w:type="dxa" w:w="9600"/>
+            <w:tcBorders>
+              <w:top w:val="none" w:color="FFFFFF" w:sz="0"/>
+              <w:left w:val="none" w:color="FFFFFF" w:sz="0"/>
+              <w:bottom w:val="single" w:color="AEB4C2" w:sz="4"/>
+              <w:right w:val="none" w:color="FFFFFF" w:sz="0"/>
+            </w:tcBorders>
+            <w:tcMar>
+              <w:top w:type="dxa" w:w="0"/>
+              <w:left w:type="dxa" w:w="0"/>
+              <w:bottom w:type="dxa" w:w="0"/>
+              <w:right w:type="dxa" w:w="0"/>
+            </w:tcMar>
+          </w:tcPr>
+          <w:p>
+            <w:pPr>
+              <w:spacing w:after="85" w:before="85"/>
+            </w:pPr>
+            <w:r>
+              <w:rPr>
+                <w:rFonts w:ascii="Calibri" w:cs="Calibri" w:eastAsia="Calibri" w:hAnsi="Calibri"/>
+                <w:color w:val="222222"/>
+                <w:sz w:val="20"/>
+                <w:szCs w:val="20"/>
+              </w:rPr>
+              <w:t xml:space="preserve"> </w:t>
+            </w:r>
+          </w:p>
+        </w:tc>
+      </w:tr>
+      <w:tr>
+        <w:tc>
+          <w:tcPr>
+            <w:tcW w:type="dxa" w:w="9600"/>
+            <w:tcBorders>
+              <w:top w:val="none" w:color="FFFFFF" w:sz="0"/>
+              <w:left w:val="none" w:color="FFFFFF" w:sz="0"/>
+              <w:bottom w:val="single" w:color="AEB4C2" w:sz="4"/>
+              <w:right w:val="none" w:color="FFFFFF" w:sz="0"/>
+            </w:tcBorders>
+            <w:tcMar>
+              <w:top w:type="dxa" w:w="0"/>
+              <w:left w:type="dxa" w:w="0"/>
+              <w:bottom w:type="dxa" w:w="0"/>
+              <w:right w:type="dxa" w:w="0"/>
+            </w:tcMar>
+          </w:tcPr>
+          <w:p>
+            <w:pPr>
+              <w:spacing w:after="85" w:before="85"/>
+            </w:pPr>
+            <w:r>
+              <w:rPr>
+                <w:rFonts w:ascii="Calibri" w:cs="Calibri" w:eastAsia="Calibri" w:hAnsi="Calibri"/>
+                <w:color w:val="222222"/>
+                <w:sz w:val="20"/>
+                <w:szCs w:val="20"/>
+              </w:rPr>
+              <w:t xml:space="preserve"> </w:t>
+            </w:r>
+          </w:p>
+        </w:tc>
+      </w:tr>
+    </w:tbl>
+    <w:p>
+      <w:pPr>
+        <w:spacing w:after="120"/>
+      </w:pPr>
+    </w:p>
+    <w:p>
+      <w:pPr>
+        <w:spacing w:after="30" w:before="100" w:line="260"/>
+      </w:pPr>
+      <w:r>
+        <w:rPr>
+          <w:rFonts w:ascii="Calibri" w:cs="Calibri" w:eastAsia="Calibri" w:hAnsi="Calibri"/>
+          <w:b/>
+          <w:bCs/>
+          <w:color w:val="222222"/>
+          <w:sz w:val="19"/>
+          <w:szCs w:val="19"/>
+        </w:rPr>
+        <w:t xml:space="preserve">3 · Why would being reversible be exactly the property you would want in a glue?</w:t>
+      </w:r>
+    </w:p>
+    <w:tbl>
+      <w:tblPr>
+        <w:tblW w:type="dxa" w:w="9600"/>
+        <w:tblBorders>
+          <w:top w:val="none" w:color="FFFFFF" w:sz="0"/>
+          <w:left w:val="none" w:color="FFFFFF" w:sz="0"/>
+          <w:bottom w:val="none" w:color="FFFFFF" w:sz="0"/>
+          <w:right w:val="none" w:color="FFFFFF" w:sz="0"/>
+          <w:insideH w:val="single" w:color="AEB4C2" w:sz="4"/>
+          <w:insideV w:val="none" w:color="FFFFFF" w:sz="0"/>
+        </w:tblBorders>
+      </w:tblPr>
+      <w:tblGrid>
+        <w:gridCol w:w="9600"/>
+      </w:tblGrid>
+      <w:tr>
+        <w:tc>
+          <w:tcPr>
+            <w:tcW w:type="dxa" w:w="9600"/>
+            <w:tcBorders>
+              <w:top w:val="none" w:color="FFFFFF" w:sz="0"/>
+              <w:left w:val="none" w:color="FFFFFF" w:sz="0"/>
+              <w:bottom w:val="single" w:color="AEB4C2" w:sz="4"/>
+              <w:right w:val="none" w:color="FFFFFF" w:sz="0"/>
+            </w:tcBorders>
+            <w:tcMar>
+              <w:top w:type="dxa" w:w="0"/>
+              <w:left w:type="dxa" w:w="0"/>
+              <w:bottom w:type="dxa" w:w="0"/>
+              <w:right w:type="dxa" w:w="0"/>
+            </w:tcMar>
+          </w:tcPr>
+          <w:p>
+            <w:pPr>
+              <w:spacing w:after="85" w:before="85"/>
+            </w:pPr>
+            <w:r>
+              <w:rPr>
+                <w:rFonts w:ascii="Calibri" w:cs="Calibri" w:eastAsia="Calibri" w:hAnsi="Calibri"/>
+                <w:color w:val="222222"/>
+                <w:sz w:val="20"/>
+                <w:szCs w:val="20"/>
+              </w:rPr>
+              <w:t xml:space="preserve"> </w:t>
+            </w:r>
+          </w:p>
+        </w:tc>
+      </w:tr>
+      <w:tr>
+        <w:tc>
+          <w:tcPr>
+            <w:tcW w:type="dxa" w:w="9600"/>
+            <w:tcBorders>
+              <w:top w:val="none" w:color="FFFFFF" w:sz="0"/>
+              <w:left w:val="none" w:color="FFFFFF" w:sz="0"/>
+              <w:bottom w:val="single" w:color="AEB4C2" w:sz="4"/>
+              <w:right w:val="none" w:color="FFFFFF" w:sz="0"/>
+            </w:tcBorders>
+            <w:tcMar>
+              <w:top w:type="dxa" w:w="0"/>
+              <w:left w:type="dxa" w:w="0"/>
+              <w:bottom w:type="dxa" w:w="0"/>
+              <w:right w:type="dxa" w:w="0"/>
+            </w:tcMar>
+          </w:tcPr>
+          <w:p>
+            <w:pPr>
+              <w:spacing w:after="85" w:before="85"/>
+            </w:pPr>
+            <w:r>
+              <w:rPr>
+                <w:rFonts w:ascii="Calibri" w:cs="Calibri" w:eastAsia="Calibri" w:hAnsi="Calibri"/>
+                <w:color w:val="222222"/>
+                <w:sz w:val="20"/>
+                <w:szCs w:val="20"/>
+              </w:rPr>
+              <w:t xml:space="preserve"> </w:t>
+            </w:r>
+          </w:p>
+        </w:tc>
+      </w:tr>
+      <w:tr>
+        <w:tc>
+          <w:tcPr>
+            <w:tcW w:type="dxa" w:w="9600"/>
+            <w:tcBorders>
+              <w:top w:val="none" w:color="FFFFFF" w:sz="0"/>
+              <w:left w:val="none" w:color="FFFFFF" w:sz="0"/>
+              <w:bottom w:val="single" w:color="AEB4C2" w:sz="4"/>
+              <w:right w:val="none" w:color="FFFFFF" w:sz="0"/>
+            </w:tcBorders>
+            <w:tcMar>
+              <w:top w:type="dxa" w:w="0"/>
+              <w:left w:type="dxa" w:w="0"/>
+              <w:bottom w:type="dxa" w:w="0"/>
+              <w:right w:type="dxa" w:w="0"/>
+            </w:tcMar>
+          </w:tcPr>
+          <w:p>
+            <w:pPr>
+              <w:spacing w:after="85" w:before="85"/>
+            </w:pPr>
+            <w:r>
+              <w:rPr>
+                <w:rFonts w:ascii="Calibri" w:cs="Calibri" w:eastAsia="Calibri" w:hAnsi="Calibri"/>
+                <w:color w:val="222222"/>
+                <w:sz w:val="20"/>
+                <w:szCs w:val="20"/>
+              </w:rPr>
+              <w:t xml:space="preserve"> </w:t>
+            </w:r>
+          </w:p>
+        </w:tc>
+      </w:tr>
+    </w:tbl>
+    <w:p>
+      <w:pPr>
+        <w:spacing w:after="120"/>
+      </w:pPr>
+    </w:p>
+    <w:p>
+      <w:pPr>
+        <w:spacing w:after="30" w:before="100" w:line="260"/>
+      </w:pPr>
+      <w:r>
+        <w:rPr>
+          <w:rFonts w:ascii="Calibri" w:cs="Calibri" w:eastAsia="Calibri" w:hAnsi="Calibri"/>
+          <w:b/>
+          <w:bCs/>
+          <w:color w:val="222222"/>
+          <w:sz w:val="19"/>
+          <w:szCs w:val="19"/>
+        </w:rPr>
+        <w:t xml:space="preserve">4 · Superglue cannot be undone. When would that be better, and when would it be worse?</w:t>
+      </w:r>
+    </w:p>
+    <w:tbl>
+      <w:tblPr>
+        <w:tblW w:type="dxa" w:w="9600"/>
+        <w:tblBorders>
+          <w:top w:val="none" w:color="FFFFFF" w:sz="0"/>
+          <w:left w:val="none" w:color="FFFFFF" w:sz="0"/>
+          <w:bottom w:val="none" w:color="FFFFFF" w:sz="0"/>
+          <w:right w:val="none" w:color="FFFFFF" w:sz="0"/>
+          <w:insideH w:val="single" w:color="AEB4C2" w:sz="4"/>
+          <w:insideV w:val="none" w:color="FFFFFF" w:sz="0"/>
+        </w:tblBorders>
+      </w:tblPr>
+      <w:tblGrid>
+        <w:gridCol w:w="9600"/>
+      </w:tblGrid>
+      <w:tr>
+        <w:tc>
+          <w:tcPr>
+            <w:tcW w:type="dxa" w:w="9600"/>
+            <w:tcBorders>
+              <w:top w:val="none" w:color="FFFFFF" w:sz="0"/>
+              <w:left w:val="none" w:color="FFFFFF" w:sz="0"/>
+              <w:bottom w:val="single" w:color="AEB4C2" w:sz="4"/>
+              <w:right w:val="none" w:color="FFFFFF" w:sz="0"/>
+            </w:tcBorders>
+            <w:tcMar>
+              <w:top w:type="dxa" w:w="0"/>
+              <w:left w:type="dxa" w:w="0"/>
+              <w:bottom w:type="dxa" w:w="0"/>
+              <w:right w:type="dxa" w:w="0"/>
+            </w:tcMar>
+          </w:tcPr>
+          <w:p>
+            <w:pPr>
+              <w:spacing w:after="85" w:before="85"/>
+            </w:pPr>
+            <w:r>
+              <w:rPr>
+                <w:rFonts w:ascii="Calibri" w:cs="Calibri" w:eastAsia="Calibri" w:hAnsi="Calibri"/>
+                <w:color w:val="222222"/>
+                <w:sz w:val="20"/>
+                <w:szCs w:val="20"/>
+              </w:rPr>
+              <w:t xml:space="preserve"> </w:t>
+            </w:r>
+          </w:p>
+        </w:tc>
+      </w:tr>
+      <w:tr>
+        <w:tc>
+          <w:tcPr>
+            <w:tcW w:type="dxa" w:w="9600"/>
+            <w:tcBorders>
+              <w:top w:val="none" w:color="FFFFFF" w:sz="0"/>
+              <w:left w:val="none" w:color="FFFFFF" w:sz="0"/>
+              <w:bottom w:val="single" w:color="AEB4C2" w:sz="4"/>
+              <w:right w:val="none" w:color="FFFFFF" w:sz="0"/>
+            </w:tcBorders>
+            <w:tcMar>
+              <w:top w:type="dxa" w:w="0"/>
+              <w:left w:type="dxa" w:w="0"/>
+              <w:bottom w:type="dxa" w:w="0"/>
+              <w:right w:type="dxa" w:w="0"/>
+            </w:tcMar>
+          </w:tcPr>
+          <w:p>
+            <w:pPr>
+              <w:spacing w:after="85" w:before="85"/>
+            </w:pPr>
+            <w:r>
+              <w:rPr>
+                <w:rFonts w:ascii="Calibri" w:cs="Calibri" w:eastAsia="Calibri" w:hAnsi="Calibri"/>
+                <w:color w:val="222222"/>
+                <w:sz w:val="20"/>
+                <w:szCs w:val="20"/>
+              </w:rPr>
+              <w:t xml:space="preserve"> </w:t>
+            </w:r>
+          </w:p>
+        </w:tc>
+      </w:tr>
+      <w:tr>
+        <w:tc>
+          <w:tcPr>
+            <w:tcW w:type="dxa" w:w="9600"/>
+            <w:tcBorders>
+              <w:top w:val="none" w:color="FFFFFF" w:sz="0"/>
+              <w:left w:val="none" w:color="FFFFFF" w:sz="0"/>
+              <w:bottom w:val="single" w:color="AEB4C2" w:sz="4"/>
+              <w:right w:val="none" w:color="FFFFFF" w:sz="0"/>
+            </w:tcBorders>
+            <w:tcMar>
+              <w:top w:type="dxa" w:w="0"/>
+              <w:left w:type="dxa" w:w="0"/>
+              <w:bottom w:type="dxa" w:w="0"/>
+              <w:right w:type="dxa" w:w="0"/>
+            </w:tcMar>
+          </w:tcPr>
+          <w:p>
+            <w:pPr>
+              <w:spacing w:after="85" w:before="85"/>
+            </w:pPr>
+            <w:r>
+              <w:rPr>
+                <w:rFonts w:ascii="Calibri" w:cs="Calibri" w:eastAsia="Calibri" w:hAnsi="Calibri"/>
+                <w:color w:val="222222"/>
+                <w:sz w:val="20"/>
+                <w:szCs w:val="20"/>
+              </w:rPr>
+              <w:t xml:space="preserve"> </w:t>
+            </w:r>
+          </w:p>
+        </w:tc>
+      </w:tr>
+    </w:tbl>
+    <w:p>
+      <w:pPr>
+        <w:spacing w:after="120"/>
+      </w:pPr>
     </w:p>
     <w:p>
       <w:r>

</xml_diff>

<commit_message>
Lesson 3 support sheet: numbering task instead of cut-up steps
Co-authored-by: Cursor <cursoragent@cursor.com>
</commit_message>
<xml_diff>
--- a/lessons/03-get-it-back/resources/l3-student-sheets-EDITABLE.docx
+++ b/lessons/03-get-it-back/resources/l3-student-sheets-EDITABLE.docx
@@ -4159,200 +4159,957 @@
           <w:b/>
           <w:bCs/>
           <w:color w:val="1B2A4A"/>
-          <w:sz w:val="34"/>
-          <w:szCs w:val="34"/>
+          <w:sz w:val="30"/>
+          <w:szCs w:val="30"/>
         </w:rPr>
         <w:t xml:space="preserve">Put the method in order</w:t>
+      </w:r>
+    </w:p>
+    <w:p>
+      <w:pPr>
+        <w:spacing w:after="140" w:before="20" w:line="260"/>
+      </w:pPr>
+      <w:r>
+        <w:rPr>
+          <w:rFonts w:ascii="Calibri" w:cs="Calibri" w:eastAsia="Calibri" w:hAnsi="Calibri"/>
+          <w:color w:val="5A6478"/>
+          <w:sz w:val="18"/>
+          <w:szCs w:val="18"/>
+        </w:rPr>
+        <w:t xml:space="preserve">Name ______________________    Group ____________    Date ____________</w:t>
+      </w:r>
+    </w:p>
+    <w:p>
+      <w:pPr>
+        <w:spacing w:after="90" w:before="20" w:line="260"/>
+      </w:pPr>
+      <w:r>
+        <w:rPr>
+          <w:rFonts w:ascii="Calibri" w:cs="Calibri" w:eastAsia="Calibri" w:hAnsi="Calibri"/>
+          <w:b/>
+          <w:bCs/>
+          <w:color w:val="222222"/>
+          <w:sz w:val="19"/>
+          <w:szCs w:val="19"/>
+        </w:rPr>
+        <w:t xml:space="preserve">My method:     FILTERING   /   DECANTING      (circle one)</w:t>
+      </w:r>
+    </w:p>
+    <w:p>
+      <w:pPr>
+        <w:spacing w:after="30" w:before="20" w:line="260"/>
+      </w:pPr>
+      <w:r>
+        <w:rPr>
+          <w:rFonts w:ascii="Calibri" w:cs="Calibri" w:eastAsia="Calibri" w:hAnsi="Calibri"/>
+          <w:color w:val="222222"/>
+          <w:sz w:val="19"/>
+          <w:szCs w:val="19"/>
+        </w:rPr>
+        <w:t xml:space="preserve">Write </w:t>
+      </w:r>
+      <w:r>
+        <w:rPr>
+          <w:rFonts w:ascii="Calibri" w:cs="Calibri" w:eastAsia="Calibri" w:hAnsi="Calibri"/>
+          <w:b/>
+          <w:bCs/>
+          <w:color w:val="222222"/>
+          <w:sz w:val="19"/>
+          <w:szCs w:val="19"/>
+        </w:rPr>
+        <w:t xml:space="preserve">1, 2, 3</w:t>
+      </w:r>
+      <w:r>
+        <w:rPr>
+          <w:rFonts w:ascii="Calibri" w:cs="Calibri" w:eastAsia="Calibri" w:hAnsi="Calibri"/>
+          <w:color w:val="222222"/>
+          <w:sz w:val="19"/>
+          <w:szCs w:val="19"/>
+        </w:rPr>
+        <w:t xml:space="preserve"> and so on in the boxes to put the steps in the right order for </w:t>
+      </w:r>
+      <w:r>
+        <w:rPr>
+          <w:rFonts w:ascii="Calibri" w:cs="Calibri" w:eastAsia="Calibri" w:hAnsi="Calibri"/>
+          <w:b/>
+          <w:bCs/>
+          <w:color w:val="222222"/>
+          <w:sz w:val="19"/>
+          <w:szCs w:val="19"/>
+        </w:rPr>
+        <w:t xml:space="preserve">your</w:t>
+      </w:r>
+      <w:r>
+        <w:rPr>
+          <w:rFonts w:ascii="Calibri" w:cs="Calibri" w:eastAsia="Calibri" w:hAnsi="Calibri"/>
+          <w:color w:val="222222"/>
+          <w:sz w:val="19"/>
+          <w:szCs w:val="19"/>
+        </w:rPr>
+        <w:t xml:space="preserve"> method, starting at 1.</w:t>
+      </w:r>
+    </w:p>
+    <w:p>
+      <w:pPr>
+        <w:spacing w:after="30" w:before="0" w:line="260"/>
+      </w:pPr>
+      <w:r>
+        <w:rPr>
+          <w:rFonts w:ascii="Calibri" w:cs="Calibri" w:eastAsia="Calibri" w:hAnsi="Calibri"/>
+          <w:color w:val="222222"/>
+          <w:sz w:val="19"/>
+          <w:szCs w:val="19"/>
+        </w:rPr>
+        <w:t xml:space="preserve">Some steps are for one method only — they are labelled. Leave those boxes empty if they are not for your method.</w:t>
+      </w:r>
+    </w:p>
+    <w:p>
+      <w:pPr>
+        <w:spacing w:after="110" w:before="0" w:line="260"/>
+      </w:pPr>
+      <w:r>
+        <w:rPr>
+          <w:rFonts w:ascii="Calibri" w:cs="Calibri" w:eastAsia="Calibri" w:hAnsi="Calibri"/>
+          <w:color w:val="222222"/>
+          <w:sz w:val="19"/>
+          <w:szCs w:val="19"/>
+        </w:rPr>
+        <w:t xml:space="preserve">Two steps do not belong in </w:t>
+      </w:r>
+      <w:r>
+        <w:rPr>
+          <w:rFonts w:ascii="Calibri" w:cs="Calibri" w:eastAsia="Calibri" w:hAnsi="Calibri"/>
+          <w:b/>
+          <w:bCs/>
+          <w:color w:val="222222"/>
+          <w:sz w:val="19"/>
+          <w:szCs w:val="19"/>
+        </w:rPr>
+        <w:t xml:space="preserve">any</w:t>
+      </w:r>
+      <w:r>
+        <w:rPr>
+          <w:rFonts w:ascii="Calibri" w:cs="Calibri" w:eastAsia="Calibri" w:hAnsi="Calibri"/>
+          <w:color w:val="222222"/>
+          <w:sz w:val="19"/>
+          <w:szCs w:val="19"/>
+        </w:rPr>
+        <w:t xml:space="preserve"> method. Put a cross in those two boxes instead of a number.</w:t>
       </w:r>
     </w:p>
     <w:tbl>
       <w:tblPr>
         <w:tblW w:type="dxa" w:w="9600"/>
         <w:tblBorders>
-          <w:top w:val="single" w:color="7E889C" w:sz="6"/>
-          <w:left w:val="single" w:color="7E889C" w:sz="6"/>
-          <w:bottom w:val="single" w:color="7E889C" w:sz="6"/>
-          <w:right w:val="single" w:color="7E889C" w:sz="6"/>
-          <w:insideH w:val="single" w:color="9AA3B5" w:sz="3"/>
-          <w:insideV w:val="single" w:color="9AA3B5" w:sz="3"/>
+          <w:top w:val="single" w:color="1B2A4A" w:sz="8"/>
+          <w:left w:val="single" w:color="1B2A4A" w:sz="8"/>
+          <w:bottom w:val="single" w:color="1B2A4A" w:sz="8"/>
+          <w:right w:val="single" w:color="1B2A4A" w:sz="8"/>
+          <w:insideH w:val="single" w:color="1B2A4A" w:sz="8"/>
+          <w:insideV w:val="single" w:color="1B2A4A" w:sz="8"/>
         </w:tblBorders>
       </w:tblPr>
       <w:tblGrid>
-        <w:gridCol w:w="4900"/>
-        <w:gridCol w:w="2400"/>
-        <w:gridCol w:w="2300"/>
+        <w:gridCol w:w="1000"/>
+        <w:gridCol w:w="8600"/>
       </w:tblGrid>
       <w:tr>
-        <w:tc>
-          <w:tcPr>
-            <w:tcW w:type="dxa" w:w="4900"/>
-            <w:shd w:fill="FBF9F4" w:val="clear"/>
-            <w:tcMar>
-              <w:top w:type="dxa" w:w="150"/>
-              <w:left w:type="dxa" w:w="110"/>
-              <w:bottom w:type="dxa" w:w="150"/>
-              <w:right w:type="dxa" w:w="110"/>
-            </w:tcMar>
-            <w:vAlign w:val="top"/>
-          </w:tcPr>
-          <w:p>
-            <w:pPr>
-              <w:spacing w:after="15" w:before="15" w:line="260"/>
+        <w:trPr>
+          <w:cantSplit/>
+        </w:trPr>
+        <w:tc>
+          <w:tcPr>
+            <w:tcW w:type="dxa" w:w="1000"/>
+            <w:shd w:fill="1B2A4A" w:val="clear"/>
+            <w:tcBorders>
+              <w:top w:val="single" w:color="1B2A4A" w:sz="8"/>
+              <w:left w:val="single" w:color="1B2A4A" w:sz="8"/>
+              <w:bottom w:val="single" w:color="1B2A4A" w:sz="8"/>
+              <w:right w:val="single" w:color="1B2A4A" w:sz="8"/>
+            </w:tcBorders>
+            <w:tcMar>
+              <w:top w:type="dxa" w:w="60"/>
+              <w:left w:type="dxa" w:w="110"/>
+              <w:bottom w:type="dxa" w:w="60"/>
+              <w:right w:type="dxa" w:w="110"/>
+            </w:tcMar>
+            <w:vAlign w:val="center"/>
+          </w:tcPr>
+          <w:p>
+            <w:pPr>
+              <w:jc w:val="center"/>
+              <w:spacing w:after="60" w:before="60"/>
             </w:pPr>
             <w:r>
               <w:rPr>
                 <w:rFonts w:ascii="Calibri" w:cs="Calibri" w:eastAsia="Calibri" w:hAnsi="Calibri"/>
                 <w:b/>
                 <w:bCs/>
-                <w:color w:val="222222"/>
+                <w:color w:val="FFFFFF"/>
                 <w:sz w:val="18"/>
                 <w:szCs w:val="18"/>
               </w:rPr>
-              <w:t xml:space="preserve">Name</w:t>
-            </w:r>
-          </w:p>
-        </w:tc>
-        <w:tc>
-          <w:tcPr>
-            <w:tcW w:type="dxa" w:w="2400"/>
-            <w:shd w:fill="FBF9F4" w:val="clear"/>
-            <w:tcMar>
-              <w:top w:type="dxa" w:w="150"/>
-              <w:left w:type="dxa" w:w="110"/>
-              <w:bottom w:type="dxa" w:w="150"/>
-              <w:right w:type="dxa" w:w="110"/>
-            </w:tcMar>
-            <w:vAlign w:val="top"/>
-          </w:tcPr>
-          <w:p>
-            <w:pPr>
-              <w:spacing w:after="15" w:before="15" w:line="260"/>
+              <w:t xml:space="preserve">No.</w:t>
+            </w:r>
+          </w:p>
+        </w:tc>
+        <w:tc>
+          <w:tcPr>
+            <w:tcW w:type="dxa" w:w="8600"/>
+            <w:shd w:fill="1B2A4A" w:val="clear"/>
+            <w:tcBorders>
+              <w:top w:val="single" w:color="1B2A4A" w:sz="8"/>
+              <w:left w:val="single" w:color="1B2A4A" w:sz="8"/>
+              <w:bottom w:val="single" w:color="1B2A4A" w:sz="8"/>
+              <w:right w:val="single" w:color="1B2A4A" w:sz="8"/>
+            </w:tcBorders>
+            <w:tcMar>
+              <w:top w:type="dxa" w:w="60"/>
+              <w:left w:type="dxa" w:w="110"/>
+              <w:bottom w:type="dxa" w:w="60"/>
+              <w:right w:type="dxa" w:w="110"/>
+            </w:tcMar>
+            <w:vAlign w:val="center"/>
+          </w:tcPr>
+          <w:p>
+            <w:pPr>
+              <w:spacing w:after="60" w:before="60"/>
             </w:pPr>
             <w:r>
               <w:rPr>
                 <w:rFonts w:ascii="Calibri" w:cs="Calibri" w:eastAsia="Calibri" w:hAnsi="Calibri"/>
                 <w:b/>
                 <w:bCs/>
-                <w:color w:val="222222"/>
+                <w:color w:val="FFFFFF"/>
                 <w:sz w:val="18"/>
                 <w:szCs w:val="18"/>
               </w:rPr>
-              <w:t xml:space="preserve">Group</w:t>
-            </w:r>
-          </w:p>
-        </w:tc>
-        <w:tc>
-          <w:tcPr>
-            <w:tcW w:type="dxa" w:w="2300"/>
-            <w:shd w:fill="FBF9F4" w:val="clear"/>
-            <w:tcMar>
-              <w:top w:type="dxa" w:w="150"/>
-              <w:left w:type="dxa" w:w="110"/>
-              <w:bottom w:type="dxa" w:w="150"/>
-              <w:right w:type="dxa" w:w="110"/>
-            </w:tcMar>
-            <w:vAlign w:val="top"/>
-          </w:tcPr>
-          <w:p>
-            <w:pPr>
-              <w:spacing w:after="15" w:before="15" w:line="260"/>
-            </w:pPr>
-            <w:r>
-              <w:rPr>
-                <w:rFonts w:ascii="Calibri" w:cs="Calibri" w:eastAsia="Calibri" w:hAnsi="Calibri"/>
-                <w:b/>
-                <w:bCs/>
-                <w:color w:val="222222"/>
-                <w:sz w:val="18"/>
-                <w:szCs w:val="18"/>
-              </w:rPr>
-              <w:t xml:space="preserve">Date</w:t>
-            </w:r>
-          </w:p>
-        </w:tc>
-      </w:tr>
-    </w:tbl>
-    <w:p>
-      <w:pPr>
-        <w:spacing w:after="70" w:before="40" w:line="260"/>
-      </w:pPr>
-      <w:r>
-        <w:rPr>
-          <w:rFonts w:ascii="Calibri" w:cs="Calibri" w:eastAsia="Calibri" w:hAnsi="Calibri"/>
-          <w:i/>
-          <w:iCs/>
-          <w:color w:val="5A6478"/>
-          <w:sz w:val="19"/>
-          <w:szCs w:val="19"/>
-        </w:rPr>
-        <w:t xml:space="preserve">Cut out the steps. Put them in the right order. WARNING: two of them do not belong at all — find them and leave them out.</w:t>
-      </w:r>
-    </w:p>
-    <w:tbl>
-      <w:tblPr>
-        <w:tblW w:type="dxa" w:w="9600"/>
-        <w:tblBorders>
-          <w:top w:val="single" w:color="555C6B" w:sz="8"/>
-          <w:left w:val="single" w:color="555C6B" w:sz="8"/>
-          <w:bottom w:val="single" w:color="555C6B" w:sz="8"/>
-          <w:right w:val="single" w:color="555C6B" w:sz="8"/>
-          <w:insideH w:val="single" w:color="555C6B" w:sz="8"/>
-          <w:insideV w:val="single" w:color="555C6B" w:sz="8"/>
-        </w:tblBorders>
-      </w:tblPr>
-      <w:tblGrid>
-        <w:gridCol w:w="9600"/>
-      </w:tblGrid>
-      <w:tr>
-        <w:tc>
-          <w:tcPr>
-            <w:tcW w:type="dxa" w:w="9600"/>
-            <w:tcMar>
-              <w:top w:type="dxa" w:w="85"/>
-              <w:left w:type="dxa" w:w="110"/>
-              <w:bottom w:type="dxa" w:w="85"/>
-              <w:right w:type="dxa" w:w="110"/>
-            </w:tcMar>
-            <w:vAlign w:val="top"/>
-          </w:tcPr>
-          <w:p>
-            <w:pPr>
-              <w:spacing w:after="150" w:before="150" w:line="260"/>
-            </w:pPr>
-            <w:r>
-              <w:rPr>
-                <w:rFonts w:ascii="Calibri" w:cs="Calibri" w:eastAsia="Calibri" w:hAnsi="Calibri"/>
-                <w:color w:val="222222"/>
-                <w:sz w:val="21"/>
-                <w:szCs w:val="21"/>
-              </w:rPr>
-              <w:t xml:space="preserve">Pour the filtered liquid into the weighed basin.</w:t>
-            </w:r>
-          </w:p>
-        </w:tc>
-      </w:tr>
-      <w:tr>
-        <w:tc>
-          <w:tcPr>
-            <w:tcW w:type="dxa" w:w="9600"/>
-            <w:tcMar>
-              <w:top w:type="dxa" w:w="85"/>
-              <w:left w:type="dxa" w:w="110"/>
-              <w:bottom w:type="dxa" w:w="85"/>
-              <w:right w:type="dxa" w:w="110"/>
-            </w:tcMar>
-            <w:vAlign w:val="top"/>
-          </w:tcPr>
-          <w:p>
-            <w:pPr>
-              <w:spacing w:after="150" w:before="150" w:line="260"/>
-            </w:pPr>
-            <w:r>
-              <w:rPr>
-                <w:rFonts w:ascii="Calibri" w:cs="Calibri" w:eastAsia="Calibri" w:hAnsi="Calibri"/>
-                <w:color w:val="222222"/>
-                <w:sz w:val="21"/>
-                <w:szCs w:val="21"/>
+              <w:t xml:space="preserve">Step</w:t>
+            </w:r>
+          </w:p>
+        </w:tc>
+      </w:tr>
+      <w:tr>
+        <w:trPr>
+          <w:cantSplit/>
+        </w:trPr>
+        <w:tc>
+          <w:tcPr>
+            <w:tcW w:type="dxa" w:w="1000"/>
+            <w:tcBorders>
+              <w:top w:val="single" w:color="1B2A4A" w:sz="8"/>
+              <w:left w:val="single" w:color="1B2A4A" w:sz="8"/>
+              <w:bottom w:val="single" w:color="1B2A4A" w:sz="8"/>
+              <w:right w:val="single" w:color="1B2A4A" w:sz="8"/>
+            </w:tcBorders>
+            <w:tcMar>
+              <w:top w:type="dxa" w:w="60"/>
+              <w:left w:type="dxa" w:w="110"/>
+              <w:bottom w:type="dxa" w:w="60"/>
+              <w:right w:type="dxa" w:w="110"/>
+            </w:tcMar>
+            <w:vAlign w:val="center"/>
+          </w:tcPr>
+          <w:p>
+            <w:pPr>
+              <w:jc w:val="center"/>
+              <w:spacing w:after="120" w:before="120"/>
+            </w:pPr>
+            <w:r>
+              <w:rPr>
+                <w:rFonts w:ascii="Calibri" w:cs="Calibri" w:eastAsia="Calibri" w:hAnsi="Calibri"/>
+                <w:color w:val="222222"/>
+                <w:sz w:val="19"/>
+                <w:szCs w:val="19"/>
+              </w:rPr>
+              <w:t xml:space="preserve"> </w:t>
+            </w:r>
+          </w:p>
+        </w:tc>
+        <w:tc>
+          <w:tcPr>
+            <w:tcW w:type="dxa" w:w="8600"/>
+            <w:tcBorders>
+              <w:top w:val="single" w:color="1B2A4A" w:sz="8"/>
+              <w:left w:val="single" w:color="1B2A4A" w:sz="8"/>
+              <w:bottom w:val="single" w:color="1B2A4A" w:sz="8"/>
+              <w:right w:val="single" w:color="1B2A4A" w:sz="8"/>
+            </w:tcBorders>
+            <w:tcMar>
+              <w:top w:type="dxa" w:w="60"/>
+              <w:left w:type="dxa" w:w="110"/>
+              <w:bottom w:type="dxa" w:w="60"/>
+              <w:right w:type="dxa" w:w="110"/>
+            </w:tcMar>
+            <w:vAlign w:val="center"/>
+          </w:tcPr>
+          <w:p>
+            <w:pPr>
+              <w:spacing w:after="60" w:before="60"/>
+            </w:pPr>
+            <w:r>
+              <w:rPr>
+                <w:rFonts w:ascii="Calibri" w:cs="Calibri" w:eastAsia="Calibri" w:hAnsi="Calibri"/>
+                <w:color w:val="222222"/>
+                <w:sz w:val="19"/>
+                <w:szCs w:val="19"/>
+              </w:rPr>
+              <w:t xml:space="preserve">Weigh the empty basin and write the number down.</w:t>
+            </w:r>
+          </w:p>
+        </w:tc>
+      </w:tr>
+      <w:tr>
+        <w:trPr>
+          <w:cantSplit/>
+        </w:trPr>
+        <w:tc>
+          <w:tcPr>
+            <w:tcW w:type="dxa" w:w="1000"/>
+            <w:tcBorders>
+              <w:top w:val="single" w:color="1B2A4A" w:sz="8"/>
+              <w:left w:val="single" w:color="1B2A4A" w:sz="8"/>
+              <w:bottom w:val="single" w:color="1B2A4A" w:sz="8"/>
+              <w:right w:val="single" w:color="1B2A4A" w:sz="8"/>
+            </w:tcBorders>
+            <w:tcMar>
+              <w:top w:type="dxa" w:w="60"/>
+              <w:left w:type="dxa" w:w="110"/>
+              <w:bottom w:type="dxa" w:w="60"/>
+              <w:right w:type="dxa" w:w="110"/>
+            </w:tcMar>
+            <w:vAlign w:val="center"/>
+          </w:tcPr>
+          <w:p>
+            <w:pPr>
+              <w:jc w:val="center"/>
+              <w:spacing w:after="120" w:before="120"/>
+            </w:pPr>
+            <w:r>
+              <w:rPr>
+                <w:rFonts w:ascii="Calibri" w:cs="Calibri" w:eastAsia="Calibri" w:hAnsi="Calibri"/>
+                <w:color w:val="222222"/>
+                <w:sz w:val="19"/>
+                <w:szCs w:val="19"/>
+              </w:rPr>
+              <w:t xml:space="preserve"> </w:t>
+            </w:r>
+          </w:p>
+        </w:tc>
+        <w:tc>
+          <w:tcPr>
+            <w:tcW w:type="dxa" w:w="8600"/>
+            <w:tcBorders>
+              <w:top w:val="single" w:color="1B2A4A" w:sz="8"/>
+              <w:left w:val="single" w:color="1B2A4A" w:sz="8"/>
+              <w:bottom w:val="single" w:color="1B2A4A" w:sz="8"/>
+              <w:right w:val="single" w:color="1B2A4A" w:sz="8"/>
+            </w:tcBorders>
+            <w:tcMar>
+              <w:top w:type="dxa" w:w="60"/>
+              <w:left w:type="dxa" w:w="110"/>
+              <w:bottom w:type="dxa" w:w="60"/>
+              <w:right w:type="dxa" w:w="110"/>
+            </w:tcMar>
+            <w:vAlign w:val="center"/>
+          </w:tcPr>
+          <w:p>
+            <w:pPr>
+              <w:spacing w:after="60" w:before="60"/>
+            </w:pPr>
+            <w:r>
+              <w:rPr>
+                <w:rFonts w:ascii="Calibri" w:cs="Calibri" w:eastAsia="Calibri" w:hAnsi="Calibri"/>
+                <w:color w:val="222222"/>
+                <w:sz w:val="19"/>
+                <w:szCs w:val="19"/>
+              </w:rPr>
+              <w:t xml:space="preserve">Fold the filter paper into a cone and sit it in the funnel.</w:t>
+            </w:r>
+            <w:r>
+              <w:rPr>
+                <w:rFonts w:ascii="Calibri" w:cs="Calibri" w:eastAsia="Calibri" w:hAnsi="Calibri"/>
+                <w:color w:val="0E7C7B"/>
+                <w:sz w:val="17"/>
+                <w:szCs w:val="17"/>
+              </w:rPr>
+              <w:t xml:space="preserve">   (filtering only)</w:t>
+            </w:r>
+          </w:p>
+        </w:tc>
+      </w:tr>
+      <w:tr>
+        <w:trPr>
+          <w:cantSplit/>
+        </w:trPr>
+        <w:tc>
+          <w:tcPr>
+            <w:tcW w:type="dxa" w:w="1000"/>
+            <w:tcBorders>
+              <w:top w:val="single" w:color="1B2A4A" w:sz="8"/>
+              <w:left w:val="single" w:color="1B2A4A" w:sz="8"/>
+              <w:bottom w:val="single" w:color="1B2A4A" w:sz="8"/>
+              <w:right w:val="single" w:color="1B2A4A" w:sz="8"/>
+            </w:tcBorders>
+            <w:tcMar>
+              <w:top w:type="dxa" w:w="60"/>
+              <w:left w:type="dxa" w:w="110"/>
+              <w:bottom w:type="dxa" w:w="60"/>
+              <w:right w:type="dxa" w:w="110"/>
+            </w:tcMar>
+            <w:vAlign w:val="center"/>
+          </w:tcPr>
+          <w:p>
+            <w:pPr>
+              <w:jc w:val="center"/>
+              <w:spacing w:after="120" w:before="120"/>
+            </w:pPr>
+            <w:r>
+              <w:rPr>
+                <w:rFonts w:ascii="Calibri" w:cs="Calibri" w:eastAsia="Calibri" w:hAnsi="Calibri"/>
+                <w:color w:val="222222"/>
+                <w:sz w:val="19"/>
+                <w:szCs w:val="19"/>
+              </w:rPr>
+              <w:t xml:space="preserve"> </w:t>
+            </w:r>
+          </w:p>
+        </w:tc>
+        <w:tc>
+          <w:tcPr>
+            <w:tcW w:type="dxa" w:w="8600"/>
+            <w:tcBorders>
+              <w:top w:val="single" w:color="1B2A4A" w:sz="8"/>
+              <w:left w:val="single" w:color="1B2A4A" w:sz="8"/>
+              <w:bottom w:val="single" w:color="1B2A4A" w:sz="8"/>
+              <w:right w:val="single" w:color="1B2A4A" w:sz="8"/>
+            </w:tcBorders>
+            <w:tcMar>
+              <w:top w:type="dxa" w:w="60"/>
+              <w:left w:type="dxa" w:w="110"/>
+              <w:bottom w:type="dxa" w:w="60"/>
+              <w:right w:type="dxa" w:w="110"/>
+            </w:tcMar>
+            <w:vAlign w:val="center"/>
+          </w:tcPr>
+          <w:p>
+            <w:pPr>
+              <w:spacing w:after="60" w:before="60"/>
+            </w:pPr>
+            <w:r>
+              <w:rPr>
+                <w:rFonts w:ascii="Calibri" w:cs="Calibri" w:eastAsia="Calibri" w:hAnsi="Calibri"/>
+                <w:color w:val="222222"/>
+                <w:sz w:val="19"/>
+                <w:szCs w:val="19"/>
+              </w:rPr>
+              <w:t xml:space="preserve">Pour the mixture slowly through the filter, into the second beaker.</w:t>
+            </w:r>
+            <w:r>
+              <w:rPr>
+                <w:rFonts w:ascii="Calibri" w:cs="Calibri" w:eastAsia="Calibri" w:hAnsi="Calibri"/>
+                <w:color w:val="0E7C7B"/>
+                <w:sz w:val="17"/>
+                <w:szCs w:val="17"/>
+              </w:rPr>
+              <w:t xml:space="preserve">   (filtering only)</w:t>
+            </w:r>
+          </w:p>
+        </w:tc>
+      </w:tr>
+      <w:tr>
+        <w:trPr>
+          <w:cantSplit/>
+        </w:trPr>
+        <w:tc>
+          <w:tcPr>
+            <w:tcW w:type="dxa" w:w="1000"/>
+            <w:tcBorders>
+              <w:top w:val="single" w:color="1B2A4A" w:sz="8"/>
+              <w:left w:val="single" w:color="1B2A4A" w:sz="8"/>
+              <w:bottom w:val="single" w:color="1B2A4A" w:sz="8"/>
+              <w:right w:val="single" w:color="1B2A4A" w:sz="8"/>
+            </w:tcBorders>
+            <w:tcMar>
+              <w:top w:type="dxa" w:w="60"/>
+              <w:left w:type="dxa" w:w="110"/>
+              <w:bottom w:type="dxa" w:w="60"/>
+              <w:right w:type="dxa" w:w="110"/>
+            </w:tcMar>
+            <w:vAlign w:val="center"/>
+          </w:tcPr>
+          <w:p>
+            <w:pPr>
+              <w:jc w:val="center"/>
+              <w:spacing w:after="120" w:before="120"/>
+            </w:pPr>
+            <w:r>
+              <w:rPr>
+                <w:rFonts w:ascii="Calibri" w:cs="Calibri" w:eastAsia="Calibri" w:hAnsi="Calibri"/>
+                <w:color w:val="222222"/>
+                <w:sz w:val="19"/>
+                <w:szCs w:val="19"/>
+              </w:rPr>
+              <w:t xml:space="preserve"> </w:t>
+            </w:r>
+          </w:p>
+        </w:tc>
+        <w:tc>
+          <w:tcPr>
+            <w:tcW w:type="dxa" w:w="8600"/>
+            <w:tcBorders>
+              <w:top w:val="single" w:color="1B2A4A" w:sz="8"/>
+              <w:left w:val="single" w:color="1B2A4A" w:sz="8"/>
+              <w:bottom w:val="single" w:color="1B2A4A" w:sz="8"/>
+              <w:right w:val="single" w:color="1B2A4A" w:sz="8"/>
+            </w:tcBorders>
+            <w:tcMar>
+              <w:top w:type="dxa" w:w="60"/>
+              <w:left w:type="dxa" w:w="110"/>
+              <w:bottom w:type="dxa" w:w="60"/>
+              <w:right w:type="dxa" w:w="110"/>
+            </w:tcMar>
+            <w:vAlign w:val="center"/>
+          </w:tcPr>
+          <w:p>
+            <w:pPr>
+              <w:spacing w:after="60" w:before="60"/>
+            </w:pPr>
+            <w:r>
+              <w:rPr>
+                <w:rFonts w:ascii="Calibri" w:cs="Calibri" w:eastAsia="Calibri" w:hAnsi="Calibri"/>
+                <w:color w:val="222222"/>
+                <w:sz w:val="19"/>
+                <w:szCs w:val="19"/>
+              </w:rPr>
+              <w:t xml:space="preserve">Let the sand settle, then pour the liquid off it carefully.</w:t>
+            </w:r>
+            <w:r>
+              <w:rPr>
+                <w:rFonts w:ascii="Calibri" w:cs="Calibri" w:eastAsia="Calibri" w:hAnsi="Calibri"/>
+                <w:color w:val="0E7C7B"/>
+                <w:sz w:val="17"/>
+                <w:szCs w:val="17"/>
+              </w:rPr>
+              <w:t xml:space="preserve">   (decanting only)</w:t>
+            </w:r>
+          </w:p>
+        </w:tc>
+      </w:tr>
+      <w:tr>
+        <w:trPr>
+          <w:cantSplit/>
+        </w:trPr>
+        <w:tc>
+          <w:tcPr>
+            <w:tcW w:type="dxa" w:w="1000"/>
+            <w:tcBorders>
+              <w:top w:val="single" w:color="1B2A4A" w:sz="8"/>
+              <w:left w:val="single" w:color="1B2A4A" w:sz="8"/>
+              <w:bottom w:val="single" w:color="1B2A4A" w:sz="8"/>
+              <w:right w:val="single" w:color="1B2A4A" w:sz="8"/>
+            </w:tcBorders>
+            <w:tcMar>
+              <w:top w:type="dxa" w:w="60"/>
+              <w:left w:type="dxa" w:w="110"/>
+              <w:bottom w:type="dxa" w:w="60"/>
+              <w:right w:type="dxa" w:w="110"/>
+            </w:tcMar>
+            <w:vAlign w:val="center"/>
+          </w:tcPr>
+          <w:p>
+            <w:pPr>
+              <w:jc w:val="center"/>
+              <w:spacing w:after="120" w:before="120"/>
+            </w:pPr>
+            <w:r>
+              <w:rPr>
+                <w:rFonts w:ascii="Calibri" w:cs="Calibri" w:eastAsia="Calibri" w:hAnsi="Calibri"/>
+                <w:color w:val="222222"/>
+                <w:sz w:val="19"/>
+                <w:szCs w:val="19"/>
+              </w:rPr>
+              <w:t xml:space="preserve"> </w:t>
+            </w:r>
+          </w:p>
+        </w:tc>
+        <w:tc>
+          <w:tcPr>
+            <w:tcW w:type="dxa" w:w="8600"/>
+            <w:tcBorders>
+              <w:top w:val="single" w:color="1B2A4A" w:sz="8"/>
+              <w:left w:val="single" w:color="1B2A4A" w:sz="8"/>
+              <w:bottom w:val="single" w:color="1B2A4A" w:sz="8"/>
+              <w:right w:val="single" w:color="1B2A4A" w:sz="8"/>
+            </w:tcBorders>
+            <w:tcMar>
+              <w:top w:type="dxa" w:w="60"/>
+              <w:left w:type="dxa" w:w="110"/>
+              <w:bottom w:type="dxa" w:w="60"/>
+              <w:right w:type="dxa" w:w="110"/>
+            </w:tcMar>
+            <w:vAlign w:val="center"/>
+          </w:tcPr>
+          <w:p>
+            <w:pPr>
+              <w:spacing w:after="60" w:before="60"/>
+            </w:pPr>
+            <w:r>
+              <w:rPr>
+                <w:rFonts w:ascii="Calibri" w:cs="Calibri" w:eastAsia="Calibri" w:hAnsi="Calibri"/>
+                <w:color w:val="222222"/>
+                <w:sz w:val="19"/>
+                <w:szCs w:val="19"/>
+              </w:rPr>
+              <w:t xml:space="preserve">Stir the sand until it dissolves.</w:t>
+            </w:r>
+          </w:p>
+        </w:tc>
+      </w:tr>
+      <w:tr>
+        <w:trPr>
+          <w:cantSplit/>
+        </w:trPr>
+        <w:tc>
+          <w:tcPr>
+            <w:tcW w:type="dxa" w:w="1000"/>
+            <w:tcBorders>
+              <w:top w:val="single" w:color="1B2A4A" w:sz="8"/>
+              <w:left w:val="single" w:color="1B2A4A" w:sz="8"/>
+              <w:bottom w:val="single" w:color="1B2A4A" w:sz="8"/>
+              <w:right w:val="single" w:color="1B2A4A" w:sz="8"/>
+            </w:tcBorders>
+            <w:tcMar>
+              <w:top w:type="dxa" w:w="60"/>
+              <w:left w:type="dxa" w:w="110"/>
+              <w:bottom w:type="dxa" w:w="60"/>
+              <w:right w:type="dxa" w:w="110"/>
+            </w:tcMar>
+            <w:vAlign w:val="center"/>
+          </w:tcPr>
+          <w:p>
+            <w:pPr>
+              <w:jc w:val="center"/>
+              <w:spacing w:after="120" w:before="120"/>
+            </w:pPr>
+            <w:r>
+              <w:rPr>
+                <w:rFonts w:ascii="Calibri" w:cs="Calibri" w:eastAsia="Calibri" w:hAnsi="Calibri"/>
+                <w:color w:val="222222"/>
+                <w:sz w:val="19"/>
+                <w:szCs w:val="19"/>
+              </w:rPr>
+              <w:t xml:space="preserve"> </w:t>
+            </w:r>
+          </w:p>
+        </w:tc>
+        <w:tc>
+          <w:tcPr>
+            <w:tcW w:type="dxa" w:w="8600"/>
+            <w:tcBorders>
+              <w:top w:val="single" w:color="1B2A4A" w:sz="8"/>
+              <w:left w:val="single" w:color="1B2A4A" w:sz="8"/>
+              <w:bottom w:val="single" w:color="1B2A4A" w:sz="8"/>
+              <w:right w:val="single" w:color="1B2A4A" w:sz="8"/>
+            </w:tcBorders>
+            <w:tcMar>
+              <w:top w:type="dxa" w:w="60"/>
+              <w:left w:type="dxa" w:w="110"/>
+              <w:bottom w:type="dxa" w:w="60"/>
+              <w:right w:type="dxa" w:w="110"/>
+            </w:tcMar>
+            <w:vAlign w:val="center"/>
+          </w:tcPr>
+          <w:p>
+            <w:pPr>
+              <w:spacing w:after="60" w:before="60"/>
+            </w:pPr>
+            <w:r>
+              <w:rPr>
+                <w:rFonts w:ascii="Calibri" w:cs="Calibri" w:eastAsia="Calibri" w:hAnsi="Calibri"/>
+                <w:color w:val="222222"/>
+                <w:sz w:val="19"/>
+                <w:szCs w:val="19"/>
+              </w:rPr>
+              <w:t xml:space="preserve">Pour the liquid into the weighed basin.</w:t>
+            </w:r>
+          </w:p>
+        </w:tc>
+      </w:tr>
+      <w:tr>
+        <w:trPr>
+          <w:cantSplit/>
+        </w:trPr>
+        <w:tc>
+          <w:tcPr>
+            <w:tcW w:type="dxa" w:w="1000"/>
+            <w:tcBorders>
+              <w:top w:val="single" w:color="1B2A4A" w:sz="8"/>
+              <w:left w:val="single" w:color="1B2A4A" w:sz="8"/>
+              <w:bottom w:val="single" w:color="1B2A4A" w:sz="8"/>
+              <w:right w:val="single" w:color="1B2A4A" w:sz="8"/>
+            </w:tcBorders>
+            <w:tcMar>
+              <w:top w:type="dxa" w:w="60"/>
+              <w:left w:type="dxa" w:w="110"/>
+              <w:bottom w:type="dxa" w:w="60"/>
+              <w:right w:type="dxa" w:w="110"/>
+            </w:tcMar>
+            <w:vAlign w:val="center"/>
+          </w:tcPr>
+          <w:p>
+            <w:pPr>
+              <w:jc w:val="center"/>
+              <w:spacing w:after="120" w:before="120"/>
+            </w:pPr>
+            <w:r>
+              <w:rPr>
+                <w:rFonts w:ascii="Calibri" w:cs="Calibri" w:eastAsia="Calibri" w:hAnsi="Calibri"/>
+                <w:color w:val="222222"/>
+                <w:sz w:val="19"/>
+                <w:szCs w:val="19"/>
+              </w:rPr>
+              <w:t xml:space="preserve"> </w:t>
+            </w:r>
+          </w:p>
+        </w:tc>
+        <w:tc>
+          <w:tcPr>
+            <w:tcW w:type="dxa" w:w="8600"/>
+            <w:tcBorders>
+              <w:top w:val="single" w:color="1B2A4A" w:sz="8"/>
+              <w:left w:val="single" w:color="1B2A4A" w:sz="8"/>
+              <w:bottom w:val="single" w:color="1B2A4A" w:sz="8"/>
+              <w:right w:val="single" w:color="1B2A4A" w:sz="8"/>
+            </w:tcBorders>
+            <w:tcMar>
+              <w:top w:type="dxa" w:w="60"/>
+              <w:left w:type="dxa" w:w="110"/>
+              <w:bottom w:type="dxa" w:w="60"/>
+              <w:right w:type="dxa" w:w="110"/>
+            </w:tcMar>
+            <w:vAlign w:val="center"/>
+          </w:tcPr>
+          <w:p>
+            <w:pPr>
+              <w:spacing w:after="60" w:before="60"/>
+            </w:pPr>
+            <w:r>
+              <w:rPr>
+                <w:rFonts w:ascii="Calibri" w:cs="Calibri" w:eastAsia="Calibri" w:hAnsi="Calibri"/>
+                <w:color w:val="222222"/>
+                <w:sz w:val="19"/>
+                <w:szCs w:val="19"/>
+              </w:rPr>
+              <w:t xml:space="preserve">Hand the basin to the teacher to go on the frypan.</w:t>
+            </w:r>
+          </w:p>
+        </w:tc>
+      </w:tr>
+      <w:tr>
+        <w:trPr>
+          <w:cantSplit/>
+        </w:trPr>
+        <w:tc>
+          <w:tcPr>
+            <w:tcW w:type="dxa" w:w="1000"/>
+            <w:tcBorders>
+              <w:top w:val="single" w:color="1B2A4A" w:sz="8"/>
+              <w:left w:val="single" w:color="1B2A4A" w:sz="8"/>
+              <w:bottom w:val="single" w:color="1B2A4A" w:sz="8"/>
+              <w:right w:val="single" w:color="1B2A4A" w:sz="8"/>
+            </w:tcBorders>
+            <w:tcMar>
+              <w:top w:type="dxa" w:w="60"/>
+              <w:left w:type="dxa" w:w="110"/>
+              <w:bottom w:type="dxa" w:w="60"/>
+              <w:right w:type="dxa" w:w="110"/>
+            </w:tcMar>
+            <w:vAlign w:val="center"/>
+          </w:tcPr>
+          <w:p>
+            <w:pPr>
+              <w:jc w:val="center"/>
+              <w:spacing w:after="120" w:before="120"/>
+            </w:pPr>
+            <w:r>
+              <w:rPr>
+                <w:rFonts w:ascii="Calibri" w:cs="Calibri" w:eastAsia="Calibri" w:hAnsi="Calibri"/>
+                <w:color w:val="222222"/>
+                <w:sz w:val="19"/>
+                <w:szCs w:val="19"/>
+              </w:rPr>
+              <w:t xml:space="preserve"> </w:t>
+            </w:r>
+          </w:p>
+        </w:tc>
+        <w:tc>
+          <w:tcPr>
+            <w:tcW w:type="dxa" w:w="8600"/>
+            <w:tcBorders>
+              <w:top w:val="single" w:color="1B2A4A" w:sz="8"/>
+              <w:left w:val="single" w:color="1B2A4A" w:sz="8"/>
+              <w:bottom w:val="single" w:color="1B2A4A" w:sz="8"/>
+              <w:right w:val="single" w:color="1B2A4A" w:sz="8"/>
+            </w:tcBorders>
+            <w:tcMar>
+              <w:top w:type="dxa" w:w="60"/>
+              <w:left w:type="dxa" w:w="110"/>
+              <w:bottom w:type="dxa" w:w="60"/>
+              <w:right w:type="dxa" w:w="110"/>
+            </w:tcMar>
+            <w:vAlign w:val="center"/>
+          </w:tcPr>
+          <w:p>
+            <w:pPr>
+              <w:spacing w:after="60" w:before="60"/>
+            </w:pPr>
+            <w:r>
+              <w:rPr>
+                <w:rFonts w:ascii="Calibri" w:cs="Calibri" w:eastAsia="Calibri" w:hAnsi="Calibri"/>
+                <w:color w:val="222222"/>
+                <w:sz w:val="19"/>
+                <w:szCs w:val="19"/>
+              </w:rPr>
+              <w:t xml:space="preserve">Wait for the water to evaporate away.</w:t>
+            </w:r>
+          </w:p>
+        </w:tc>
+      </w:tr>
+      <w:tr>
+        <w:trPr>
+          <w:cantSplit/>
+        </w:trPr>
+        <w:tc>
+          <w:tcPr>
+            <w:tcW w:type="dxa" w:w="1000"/>
+            <w:tcBorders>
+              <w:top w:val="single" w:color="1B2A4A" w:sz="8"/>
+              <w:left w:val="single" w:color="1B2A4A" w:sz="8"/>
+              <w:bottom w:val="single" w:color="1B2A4A" w:sz="8"/>
+              <w:right w:val="single" w:color="1B2A4A" w:sz="8"/>
+            </w:tcBorders>
+            <w:tcMar>
+              <w:top w:type="dxa" w:w="60"/>
+              <w:left w:type="dxa" w:w="110"/>
+              <w:bottom w:type="dxa" w:w="60"/>
+              <w:right w:type="dxa" w:w="110"/>
+            </w:tcMar>
+            <w:vAlign w:val="center"/>
+          </w:tcPr>
+          <w:p>
+            <w:pPr>
+              <w:jc w:val="center"/>
+              <w:spacing w:after="120" w:before="120"/>
+            </w:pPr>
+            <w:r>
+              <w:rPr>
+                <w:rFonts w:ascii="Calibri" w:cs="Calibri" w:eastAsia="Calibri" w:hAnsi="Calibri"/>
+                <w:color w:val="222222"/>
+                <w:sz w:val="19"/>
+                <w:szCs w:val="19"/>
+              </w:rPr>
+              <w:t xml:space="preserve"> </w:t>
+            </w:r>
+          </w:p>
+        </w:tc>
+        <w:tc>
+          <w:tcPr>
+            <w:tcW w:type="dxa" w:w="8600"/>
+            <w:tcBorders>
+              <w:top w:val="single" w:color="1B2A4A" w:sz="8"/>
+              <w:left w:val="single" w:color="1B2A4A" w:sz="8"/>
+              <w:bottom w:val="single" w:color="1B2A4A" w:sz="8"/>
+              <w:right w:val="single" w:color="1B2A4A" w:sz="8"/>
+            </w:tcBorders>
+            <w:tcMar>
+              <w:top w:type="dxa" w:w="60"/>
+              <w:left w:type="dxa" w:w="110"/>
+              <w:bottom w:type="dxa" w:w="60"/>
+              <w:right w:type="dxa" w:w="110"/>
+            </w:tcMar>
+            <w:vAlign w:val="center"/>
+          </w:tcPr>
+          <w:p>
+            <w:pPr>
+              <w:spacing w:after="60" w:before="60"/>
+            </w:pPr>
+            <w:r>
+              <w:rPr>
+                <w:rFonts w:ascii="Calibri" w:cs="Calibri" w:eastAsia="Calibri" w:hAnsi="Calibri"/>
+                <w:color w:val="222222"/>
+                <w:sz w:val="19"/>
+                <w:szCs w:val="19"/>
+              </w:rPr>
+              <w:t xml:space="preserve">Pour the salt down the sink and start again.</w:t>
+            </w:r>
+          </w:p>
+        </w:tc>
+      </w:tr>
+      <w:tr>
+        <w:trPr>
+          <w:cantSplit/>
+        </w:trPr>
+        <w:tc>
+          <w:tcPr>
+            <w:tcW w:type="dxa" w:w="1000"/>
+            <w:tcBorders>
+              <w:top w:val="single" w:color="1B2A4A" w:sz="8"/>
+              <w:left w:val="single" w:color="1B2A4A" w:sz="8"/>
+              <w:bottom w:val="single" w:color="1B2A4A" w:sz="8"/>
+              <w:right w:val="single" w:color="1B2A4A" w:sz="8"/>
+            </w:tcBorders>
+            <w:tcMar>
+              <w:top w:type="dxa" w:w="60"/>
+              <w:left w:type="dxa" w:w="110"/>
+              <w:bottom w:type="dxa" w:w="60"/>
+              <w:right w:type="dxa" w:w="110"/>
+            </w:tcMar>
+            <w:vAlign w:val="center"/>
+          </w:tcPr>
+          <w:p>
+            <w:pPr>
+              <w:jc w:val="center"/>
+              <w:spacing w:after="120" w:before="120"/>
+            </w:pPr>
+            <w:r>
+              <w:rPr>
+                <w:rFonts w:ascii="Calibri" w:cs="Calibri" w:eastAsia="Calibri" w:hAnsi="Calibri"/>
+                <w:color w:val="222222"/>
+                <w:sz w:val="19"/>
+                <w:szCs w:val="19"/>
+              </w:rPr>
+              <w:t xml:space="preserve"> </w:t>
+            </w:r>
+          </w:p>
+        </w:tc>
+        <w:tc>
+          <w:tcPr>
+            <w:tcW w:type="dxa" w:w="8600"/>
+            <w:tcBorders>
+              <w:top w:val="single" w:color="1B2A4A" w:sz="8"/>
+              <w:left w:val="single" w:color="1B2A4A" w:sz="8"/>
+              <w:bottom w:val="single" w:color="1B2A4A" w:sz="8"/>
+              <w:right w:val="single" w:color="1B2A4A" w:sz="8"/>
+            </w:tcBorders>
+            <w:tcMar>
+              <w:top w:type="dxa" w:w="60"/>
+              <w:left w:type="dxa" w:w="110"/>
+              <w:bottom w:type="dxa" w:w="60"/>
+              <w:right w:type="dxa" w:w="110"/>
+            </w:tcMar>
+            <w:vAlign w:val="center"/>
+          </w:tcPr>
+          <w:p>
+            <w:pPr>
+              <w:spacing w:after="60" w:before="60"/>
+            </w:pPr>
+            <w:r>
+              <w:rPr>
+                <w:rFonts w:ascii="Calibri" w:cs="Calibri" w:eastAsia="Calibri" w:hAnsi="Calibri"/>
+                <w:color w:val="222222"/>
+                <w:sz w:val="19"/>
+                <w:szCs w:val="19"/>
               </w:rPr>
               <w:t xml:space="preserve">Let the basin cool for five minutes.</w:t>
             </w:r>
@@ -4360,281 +5117,141 @@
         </w:tc>
       </w:tr>
       <w:tr>
-        <w:tc>
-          <w:tcPr>
-            <w:tcW w:type="dxa" w:w="9600"/>
-            <w:tcMar>
-              <w:top w:type="dxa" w:w="85"/>
-              <w:left w:type="dxa" w:w="110"/>
-              <w:bottom w:type="dxa" w:w="85"/>
-              <w:right w:type="dxa" w:w="110"/>
-            </w:tcMar>
-            <w:vAlign w:val="top"/>
-          </w:tcPr>
-          <w:p>
-            <w:pPr>
-              <w:spacing w:after="150" w:before="150" w:line="260"/>
-            </w:pPr>
-            <w:r>
-              <w:rPr>
-                <w:rFonts w:ascii="Calibri" w:cs="Calibri" w:eastAsia="Calibri" w:hAnsi="Calibri"/>
-                <w:color w:val="222222"/>
-                <w:sz w:val="21"/>
-                <w:szCs w:val="21"/>
-              </w:rPr>
-              <w:t xml:space="preserve">Fold the filter paper into a cone and sit it in the funnel.  (filtering)</w:t>
-            </w:r>
-          </w:p>
-        </w:tc>
-      </w:tr>
-      <w:tr>
-        <w:tc>
-          <w:tcPr>
-            <w:tcW w:type="dxa" w:w="9600"/>
-            <w:tcMar>
-              <w:top w:type="dxa" w:w="85"/>
-              <w:left w:type="dxa" w:w="110"/>
-              <w:bottom w:type="dxa" w:w="85"/>
-              <w:right w:type="dxa" w:w="110"/>
-            </w:tcMar>
-            <w:vAlign w:val="top"/>
-          </w:tcPr>
-          <w:p>
-            <w:pPr>
-              <w:spacing w:after="150" w:before="150" w:line="260"/>
-            </w:pPr>
-            <w:r>
-              <w:rPr>
-                <w:rFonts w:ascii="Calibri" w:cs="Calibri" w:eastAsia="Calibri" w:hAnsi="Calibri"/>
-                <w:color w:val="222222"/>
-                <w:sz w:val="21"/>
-                <w:szCs w:val="21"/>
-              </w:rPr>
-              <w:t xml:space="preserve">Stir the sand until it dissolves.</w:t>
-            </w:r>
-          </w:p>
-        </w:tc>
-      </w:tr>
-      <w:tr>
-        <w:tc>
-          <w:tcPr>
-            <w:tcW w:type="dxa" w:w="9600"/>
-            <w:tcMar>
-              <w:top w:type="dxa" w:w="85"/>
-              <w:left w:type="dxa" w:w="110"/>
-              <w:bottom w:type="dxa" w:w="85"/>
-              <w:right w:type="dxa" w:w="110"/>
-            </w:tcMar>
-            <w:vAlign w:val="top"/>
-          </w:tcPr>
-          <w:p>
-            <w:pPr>
-              <w:spacing w:after="150" w:before="150" w:line="260"/>
-            </w:pPr>
-            <w:r>
-              <w:rPr>
-                <w:rFonts w:ascii="Calibri" w:cs="Calibri" w:eastAsia="Calibri" w:hAnsi="Calibri"/>
-                <w:color w:val="222222"/>
-                <w:sz w:val="21"/>
-                <w:szCs w:val="21"/>
+        <w:trPr>
+          <w:cantSplit/>
+        </w:trPr>
+        <w:tc>
+          <w:tcPr>
+            <w:tcW w:type="dxa" w:w="1000"/>
+            <w:tcBorders>
+              <w:top w:val="single" w:color="1B2A4A" w:sz="8"/>
+              <w:left w:val="single" w:color="1B2A4A" w:sz="8"/>
+              <w:bottom w:val="single" w:color="1B2A4A" w:sz="8"/>
+              <w:right w:val="single" w:color="1B2A4A" w:sz="8"/>
+            </w:tcBorders>
+            <w:tcMar>
+              <w:top w:type="dxa" w:w="60"/>
+              <w:left w:type="dxa" w:w="110"/>
+              <w:bottom w:type="dxa" w:w="60"/>
+              <w:right w:type="dxa" w:w="110"/>
+            </w:tcMar>
+            <w:vAlign w:val="center"/>
+          </w:tcPr>
+          <w:p>
+            <w:pPr>
+              <w:jc w:val="center"/>
+              <w:spacing w:after="120" w:before="120"/>
+            </w:pPr>
+            <w:r>
+              <w:rPr>
+                <w:rFonts w:ascii="Calibri" w:cs="Calibri" w:eastAsia="Calibri" w:hAnsi="Calibri"/>
+                <w:color w:val="222222"/>
+                <w:sz w:val="19"/>
+                <w:szCs w:val="19"/>
+              </w:rPr>
+              <w:t xml:space="preserve"> </w:t>
+            </w:r>
+          </w:p>
+        </w:tc>
+        <w:tc>
+          <w:tcPr>
+            <w:tcW w:type="dxa" w:w="8600"/>
+            <w:tcBorders>
+              <w:top w:val="single" w:color="1B2A4A" w:sz="8"/>
+              <w:left w:val="single" w:color="1B2A4A" w:sz="8"/>
+              <w:bottom w:val="single" w:color="1B2A4A" w:sz="8"/>
+              <w:right w:val="single" w:color="1B2A4A" w:sz="8"/>
+            </w:tcBorders>
+            <w:tcMar>
+              <w:top w:type="dxa" w:w="60"/>
+              <w:left w:type="dxa" w:w="110"/>
+              <w:bottom w:type="dxa" w:w="60"/>
+              <w:right w:type="dxa" w:w="110"/>
+            </w:tcMar>
+            <w:vAlign w:val="center"/>
+          </w:tcPr>
+          <w:p>
+            <w:pPr>
+              <w:spacing w:after="60" w:before="60"/>
+            </w:pPr>
+            <w:r>
+              <w:rPr>
+                <w:rFonts w:ascii="Calibri" w:cs="Calibri" w:eastAsia="Calibri" w:hAnsi="Calibri"/>
+                <w:color w:val="222222"/>
+                <w:sz w:val="19"/>
+                <w:szCs w:val="19"/>
+              </w:rPr>
+              <w:t xml:space="preserve">Weigh the basin with the salt in it.</w:t>
+            </w:r>
+          </w:p>
+        </w:tc>
+      </w:tr>
+      <w:tr>
+        <w:trPr>
+          <w:cantSplit/>
+        </w:trPr>
+        <w:tc>
+          <w:tcPr>
+            <w:tcW w:type="dxa" w:w="1000"/>
+            <w:tcBorders>
+              <w:top w:val="single" w:color="1B2A4A" w:sz="8"/>
+              <w:left w:val="single" w:color="1B2A4A" w:sz="8"/>
+              <w:bottom w:val="single" w:color="1B2A4A" w:sz="8"/>
+              <w:right w:val="single" w:color="1B2A4A" w:sz="8"/>
+            </w:tcBorders>
+            <w:tcMar>
+              <w:top w:type="dxa" w:w="60"/>
+              <w:left w:type="dxa" w:w="110"/>
+              <w:bottom w:type="dxa" w:w="60"/>
+              <w:right w:type="dxa" w:w="110"/>
+            </w:tcMar>
+            <w:vAlign w:val="center"/>
+          </w:tcPr>
+          <w:p>
+            <w:pPr>
+              <w:jc w:val="center"/>
+              <w:spacing w:after="120" w:before="120"/>
+            </w:pPr>
+            <w:r>
+              <w:rPr>
+                <w:rFonts w:ascii="Calibri" w:cs="Calibri" w:eastAsia="Calibri" w:hAnsi="Calibri"/>
+                <w:color w:val="222222"/>
+                <w:sz w:val="19"/>
+                <w:szCs w:val="19"/>
+              </w:rPr>
+              <w:t xml:space="preserve"> </w:t>
+            </w:r>
+          </w:p>
+        </w:tc>
+        <w:tc>
+          <w:tcPr>
+            <w:tcW w:type="dxa" w:w="8600"/>
+            <w:tcBorders>
+              <w:top w:val="single" w:color="1B2A4A" w:sz="8"/>
+              <w:left w:val="single" w:color="1B2A4A" w:sz="8"/>
+              <w:bottom w:val="single" w:color="1B2A4A" w:sz="8"/>
+              <w:right w:val="single" w:color="1B2A4A" w:sz="8"/>
+            </w:tcBorders>
+            <w:tcMar>
+              <w:top w:type="dxa" w:w="60"/>
+              <w:left w:type="dxa" w:w="110"/>
+              <w:bottom w:type="dxa" w:w="60"/>
+              <w:right w:type="dxa" w:w="110"/>
+            </w:tcMar>
+            <w:vAlign w:val="center"/>
+          </w:tcPr>
+          <w:p>
+            <w:pPr>
+              <w:spacing w:after="60" w:before="60"/>
+            </w:pPr>
+            <w:r>
+              <w:rPr>
+                <w:rFonts w:ascii="Calibri" w:cs="Calibri" w:eastAsia="Calibri" w:hAnsi="Calibri"/>
+                <w:color w:val="222222"/>
+                <w:sz w:val="19"/>
+                <w:szCs w:val="19"/>
               </w:rPr>
               <w:t xml:space="preserve">Subtract the empty basin mass to find the salt recovered.</w:t>
-            </w:r>
-          </w:p>
-        </w:tc>
-      </w:tr>
-      <w:tr>
-        <w:tc>
-          <w:tcPr>
-            <w:tcW w:type="dxa" w:w="9600"/>
-            <w:tcMar>
-              <w:top w:type="dxa" w:w="85"/>
-              <w:left w:type="dxa" w:w="110"/>
-              <w:bottom w:type="dxa" w:w="85"/>
-              <w:right w:type="dxa" w:w="110"/>
-            </w:tcMar>
-            <w:vAlign w:val="top"/>
-          </w:tcPr>
-          <w:p>
-            <w:pPr>
-              <w:spacing w:after="150" w:before="150" w:line="260"/>
-            </w:pPr>
-            <w:r>
-              <w:rPr>
-                <w:rFonts w:ascii="Calibri" w:cs="Calibri" w:eastAsia="Calibri" w:hAnsi="Calibri"/>
-                <w:color w:val="222222"/>
-                <w:sz w:val="21"/>
-                <w:szCs w:val="21"/>
-              </w:rPr>
-              <w:t xml:space="preserve">Hand the basin to the teacher to go on the frypan.</w:t>
-            </w:r>
-          </w:p>
-        </w:tc>
-      </w:tr>
-      <w:tr>
-        <w:tc>
-          <w:tcPr>
-            <w:tcW w:type="dxa" w:w="9600"/>
-            <w:tcMar>
-              <w:top w:type="dxa" w:w="85"/>
-              <w:left w:type="dxa" w:w="110"/>
-              <w:bottom w:type="dxa" w:w="85"/>
-              <w:right w:type="dxa" w:w="110"/>
-            </w:tcMar>
-            <w:vAlign w:val="top"/>
-          </w:tcPr>
-          <w:p>
-            <w:pPr>
-              <w:spacing w:after="150" w:before="150" w:line="260"/>
-            </w:pPr>
-            <w:r>
-              <w:rPr>
-                <w:rFonts w:ascii="Calibri" w:cs="Calibri" w:eastAsia="Calibri" w:hAnsi="Calibri"/>
-                <w:color w:val="222222"/>
-                <w:sz w:val="21"/>
-                <w:szCs w:val="21"/>
-              </w:rPr>
-              <w:t xml:space="preserve">Weigh the empty basin and write the number down.</w:t>
-            </w:r>
-          </w:p>
-        </w:tc>
-      </w:tr>
-      <w:tr>
-        <w:tc>
-          <w:tcPr>
-            <w:tcW w:type="dxa" w:w="9600"/>
-            <w:tcMar>
-              <w:top w:type="dxa" w:w="85"/>
-              <w:left w:type="dxa" w:w="110"/>
-              <w:bottom w:type="dxa" w:w="85"/>
-              <w:right w:type="dxa" w:w="110"/>
-            </w:tcMar>
-            <w:vAlign w:val="top"/>
-          </w:tcPr>
-          <w:p>
-            <w:pPr>
-              <w:spacing w:after="150" w:before="150" w:line="260"/>
-            </w:pPr>
-            <w:r>
-              <w:rPr>
-                <w:rFonts w:ascii="Calibri" w:cs="Calibri" w:eastAsia="Calibri" w:hAnsi="Calibri"/>
-                <w:color w:val="222222"/>
-                <w:sz w:val="21"/>
-                <w:szCs w:val="21"/>
-              </w:rPr>
-              <w:t xml:space="preserve">Weigh the basin with the salt in it.</w:t>
-            </w:r>
-          </w:p>
-        </w:tc>
-      </w:tr>
-      <w:tr>
-        <w:tc>
-          <w:tcPr>
-            <w:tcW w:type="dxa" w:w="9600"/>
-            <w:tcMar>
-              <w:top w:type="dxa" w:w="85"/>
-              <w:left w:type="dxa" w:w="110"/>
-              <w:bottom w:type="dxa" w:w="85"/>
-              <w:right w:type="dxa" w:w="110"/>
-            </w:tcMar>
-            <w:vAlign w:val="top"/>
-          </w:tcPr>
-          <w:p>
-            <w:pPr>
-              <w:spacing w:after="150" w:before="150" w:line="260"/>
-            </w:pPr>
-            <w:r>
-              <w:rPr>
-                <w:rFonts w:ascii="Calibri" w:cs="Calibri" w:eastAsia="Calibri" w:hAnsi="Calibri"/>
-                <w:color w:val="222222"/>
-                <w:sz w:val="21"/>
-                <w:szCs w:val="21"/>
-              </w:rPr>
-              <w:t xml:space="preserve">Pour the salt down the sink and start again.</w:t>
-            </w:r>
-          </w:p>
-        </w:tc>
-      </w:tr>
-      <w:tr>
-        <w:tc>
-          <w:tcPr>
-            <w:tcW w:type="dxa" w:w="9600"/>
-            <w:tcMar>
-              <w:top w:type="dxa" w:w="85"/>
-              <w:left w:type="dxa" w:w="110"/>
-              <w:bottom w:type="dxa" w:w="85"/>
-              <w:right w:type="dxa" w:w="110"/>
-            </w:tcMar>
-            <w:vAlign w:val="top"/>
-          </w:tcPr>
-          <w:p>
-            <w:pPr>
-              <w:spacing w:after="150" w:before="150" w:line="260"/>
-            </w:pPr>
-            <w:r>
-              <w:rPr>
-                <w:rFonts w:ascii="Calibri" w:cs="Calibri" w:eastAsia="Calibri" w:hAnsi="Calibri"/>
-                <w:color w:val="222222"/>
-                <w:sz w:val="21"/>
-                <w:szCs w:val="21"/>
-              </w:rPr>
-              <w:t xml:space="preserve">Pour the mixture slowly through the filter, into the second beaker.  (filtering)</w:t>
-            </w:r>
-          </w:p>
-        </w:tc>
-      </w:tr>
-      <w:tr>
-        <w:tc>
-          <w:tcPr>
-            <w:tcW w:type="dxa" w:w="9600"/>
-            <w:tcMar>
-              <w:top w:type="dxa" w:w="85"/>
-              <w:left w:type="dxa" w:w="110"/>
-              <w:bottom w:type="dxa" w:w="85"/>
-              <w:right w:type="dxa" w:w="110"/>
-            </w:tcMar>
-            <w:vAlign w:val="top"/>
-          </w:tcPr>
-          <w:p>
-            <w:pPr>
-              <w:spacing w:after="150" w:before="150" w:line="260"/>
-            </w:pPr>
-            <w:r>
-              <w:rPr>
-                <w:rFonts w:ascii="Calibri" w:cs="Calibri" w:eastAsia="Calibri" w:hAnsi="Calibri"/>
-                <w:color w:val="222222"/>
-                <w:sz w:val="21"/>
-                <w:szCs w:val="21"/>
-              </w:rPr>
-              <w:t xml:space="preserve">Wait for the water to evaporate away.</w:t>
-            </w:r>
-          </w:p>
-        </w:tc>
-      </w:tr>
-      <w:tr>
-        <w:tc>
-          <w:tcPr>
-            <w:tcW w:type="dxa" w:w="9600"/>
-            <w:tcMar>
-              <w:top w:type="dxa" w:w="85"/>
-              <w:left w:type="dxa" w:w="110"/>
-              <w:bottom w:type="dxa" w:w="85"/>
-              <w:right w:type="dxa" w:w="110"/>
-            </w:tcMar>
-            <w:vAlign w:val="top"/>
-          </w:tcPr>
-          <w:p>
-            <w:pPr>
-              <w:spacing w:after="150" w:before="150" w:line="260"/>
-            </w:pPr>
-            <w:r>
-              <w:rPr>
-                <w:rFonts w:ascii="Calibri" w:cs="Calibri" w:eastAsia="Calibri" w:hAnsi="Calibri"/>
-                <w:color w:val="222222"/>
-                <w:sz w:val="21"/>
-                <w:szCs w:val="21"/>
-              </w:rPr>
-              <w:t xml:space="preserve">Let the sand settle, then pour the liquid off it carefully.  (decanting)</w:t>
             </w:r>
           </w:p>
         </w:tc>

</xml_diff>